<commit_message>
Better handling of text overlay
The update better handles cases where overlays are stacked. The report also operates more cleanly now.
</commit_message>
<xml_diff>
--- a/Application/Documentation/00_Getting_Started.docx
+++ b/Application/Documentation/00_Getting_Started.docx
@@ -70,6 +70,20 @@
           <w:sz w:val="20"/>
         </w:rPr>
         <w:t>Released under the Apache License, Version 2.0</w:t>
+      </w:r>
+    </w:p>
+    <w:p>
+      <w:pPr>
+        <w:spacing w:after="280" w:before="0"/>
+      </w:pPr>
+      <w:r>
+        <w:rPr>
+          <w:rFonts w:ascii="Arial" w:hAnsi="Arial"/>
+          <w:b w:val="0"/>
+          <w:color w:val="5A5A5A"/>
+          <w:sz w:val="20"/>
+        </w:rPr>
+        <w:t>Document Date: October 6, 2026 · Build 2026-10-06</w:t>
       </w:r>
     </w:p>
     <w:p>

</xml_diff>

<commit_message>
Fixes to feature to decrypt encrypted PDFs
Application updated to better handle and report on encrypted PDFs that it could decrypt using a password text file.
</commit_message>
<xml_diff>
--- a/Application/Documentation/00_Getting_Started.docx
+++ b/Application/Documentation/00_Getting_Started.docx
@@ -83,7 +83,7 @@
           <w:color w:val="5A5A5A"/>
           <w:sz w:val="20"/>
         </w:rPr>
-        <w:t>Document Date: October 13, 2026 · Applies to PDF Forensics Suite v1.0.0, build 2026-10-13</w:t>
+        <w:t>Document Date: October 14, 2026 · Applies to PDF Forensics Suite v1.0.0, build 2026-10-14</w:t>
       </w:r>
     </w:p>
     <w:p>
@@ -301,6 +301,34 @@
           <w:szCs w:val="22"/>
         </w:rPr>
         <w:t xml:space="preserve">This is the usual way to work through a large volume of PDFs selectively. Run Triage on everything first, review the triage spreadsheet, and copy the Path column for the documents that warrant full analysis into a text file (Notepad is fine). Then load that file with “From list” and run the analysis. Copy the Path column rather than the Filename column, because the list needs the full path to each file. Prior-version rows in the triage spreadsheet carry their parent document’s path, so copying them as well does no harm: the duplicates are ignored.</w:t>
+      </w:r>
+    </w:p>
+    <w:p>
+      <w:pPr>
+        <w:spacing w:after="80" w:before="80"/>
+      </w:pPr>
+      <w:r>
+        <w:rPr>
+          <w:rFonts w:ascii="Arial" w:cs="Arial" w:eastAsia="Arial" w:hAnsi="Arial"/>
+          <w:color w:val="000000"/>
+          <w:sz w:val="22"/>
+          <w:szCs w:val="22"/>
+        </w:rPr>
+        <w:t xml:space="preserve">Encrypted PDFs. If a document is protected by a password, the application tries to open it, in triage as well as analysis. A file that is encrypted only to set permissions opens by itself. For a file that needs a real password, use “Password list…” to select a text file of candidate passwords (ones you already hold), one per line; the application tries each in turn and stops at the first that works, and a password that works is tried first on the files that follow. Nothing is written to the file and the PDF is not modified. The Encrypted Files report lists every encrypted PDF, the password that opened it, or a note that none did. The report contains passwords, so handle it as carefully as the list itself.</w:t>
+      </w:r>
+    </w:p>
+    <w:p>
+      <w:pPr>
+        <w:spacing w:after="80" w:before="80"/>
+      </w:pPr>
+      <w:r>
+        <w:rPr>
+          <w:rFonts w:ascii="Arial" w:cs="Arial" w:eastAsia="Arial" w:hAnsi="Arial"/>
+          <w:color w:val="000000"/>
+          <w:sz w:val="22"/>
+          <w:szCs w:val="22"/>
+        </w:rPr>
+        <w:t xml:space="preserve">You do not have to choose a list before starting. If the run meets password-protected files and no list was supplied, or the list did not open them, the application sets those files aside and, at the end of the run, offers to try a password list on just those files. This keeps a large batch from stopping to wait for you partway through.</w:t>
       </w:r>
     </w:p>
     <w:p>

</xml_diff>

<commit_message>
Update to deal with false positives for prior versions
A "linearized (fast web view)" PDF isn't a saved earlier version.
</commit_message>
<xml_diff>
--- a/Application/Documentation/00_Getting_Started.docx
+++ b/Application/Documentation/00_Getting_Started.docx
@@ -83,7 +83,7 @@
           <w:color w:val="5A5A5A"/>
           <w:sz w:val="20"/>
         </w:rPr>
-        <w:t>Document Date: October 15, 2026 · Applies to PDF Forensics Suite v1.0.0, build 2026-10-15</w:t>
+        <w:t>Document Date: October 20, 2026 · Applies to PDF Forensics Suite v1.0.0, build 2026-10-20</w:t>
       </w:r>
     </w:p>
     <w:p>
@@ -409,6 +409,20 @@
           <w:sz w:val="22"/>
         </w:rPr>
         <w:t>If you only need a fast overview of a large set of documents rather than a full examination, enable Triage mode, which writes a summary Excel spreadsheet instead of running the complete analysis. The triage spreadsheet has a pdf-triage overview sheet and a pdf-metadata sheet; when a document contains incremental updates, each prior version’s metadata is included as its own row, labelled in a Source column (“Current” or “Prior v1”, “Prior v2”, and so on), so the metadata of earlier saved versions can be compared against the current one without running a full analysis.</w:t>
+      </w:r>
+    </w:p>
+    <w:p>
+      <w:pPr>
+        <w:spacing w:after="80" w:before="80"/>
+      </w:pPr>
+      <w:r>
+        <w:rPr>
+          <w:rFonts w:ascii="Arial" w:cs="Arial" w:eastAsia="Arial" w:hAnsi="Arial"/>
+          <w:color w:val="000000"/>
+          <w:sz w:val="22"/>
+          <w:szCs w:val="22"/>
+        </w:rPr>
+        <w:t xml:space="preserve">Not every %%EOF marker ends a saved version. In a linearized (“fast web view”) PDF the first %%EOF ends a small first-page section near the start of the file, and some markers end bytes that are not a usable PDF on their own. The application checks each one before treating it as a prior version: only genuine, usable earlier versions are listed, extracted and analysed, and the triage spreadsheet’s Prior-Version Check column explains any marker that was not treated as a version.</w:t>
       </w:r>
     </w:p>
     <w:tbl>

</xml_diff>

<commit_message>
Minor corrections to triage and logging
Triage previously wasn't trying passwords in prior versions. Corrected. Some tool output was not being logged to the log file. See changelog.md for more details on changes.
</commit_message>
<xml_diff>
--- a/Application/Documentation/00_Getting_Started.docx
+++ b/Application/Documentation/00_Getting_Started.docx
@@ -13,7 +13,7 @@
           <w:color w:val="1B1B1B"/>
           <w:sz w:val="52"/>
         </w:rPr>
-        <w:t>PDF FORENSICS SUITE v1.0.0</w:t>
+        <w:t>PDF FORENSICS SUITE v1.0.1</w:t>
       </w:r>
     </w:p>
     <w:p>
@@ -83,7 +83,7 @@
           <w:color w:val="5A5A5A"/>
           <w:sz w:val="20"/>
         </w:rPr>
-        <w:t>Document Date: October 20, 2026 · Applies to PDF Forensics Suite v1.0.0, build 2026-10-20</w:t>
+        <w:t>Document Date: October 21, 2026 · Applies to PDF Forensics Suite v1.0.1, build 2026-10-21</w:t>
       </w:r>
     </w:p>
     <w:p>

</xml_diff>

<commit_message>
Improved handling of PDF Version number
</commit_message>
<xml_diff>
--- a/Application/Documentation/00_Getting_Started.docx
+++ b/Application/Documentation/00_Getting_Started.docx
@@ -13,7 +13,7 @@
           <w:color w:val="1B1B1B"/>
           <w:sz w:val="52"/>
         </w:rPr>
-        <w:t>PDF FORENSICS SUITE v1.0.2</w:t>
+        <w:t>PDF FORENSICS SUITE v1.0.3</w:t>
       </w:r>
     </w:p>
     <w:p>
@@ -83,7 +83,7 @@
           <w:color w:val="5A5A5A"/>
           <w:sz w:val="20"/>
         </w:rPr>
-        <w:t>Document Date: October 22, 2026 · Applies to PDF Forensics Suite v1.0.2, build 2026-10-22</w:t>
+        <w:t>Document Date: October 22, 2026 · Applies to PDF Forensics Suite v1.0.3, build 2026-10-22b</w:t>
       </w:r>
     </w:p>
     <w:p>

</xml_diff>

<commit_message>
Minor tweaks to timeline feature, and added an Excel output
</commit_message>
<xml_diff>
--- a/Application/Documentation/00_Getting_Started.docx
+++ b/Application/Documentation/00_Getting_Started.docx
@@ -13,7 +13,7 @@
           <w:color w:val="1B1B1B"/>
           <w:sz w:val="52"/>
         </w:rPr>
-        <w:t>PDF FORENSICS SUITE v1.1.0</w:t>
+        <w:t>PDF FORENSICS SUITE v1.1.1</w:t>
       </w:r>
     </w:p>
     <w:p>
@@ -83,7 +83,7 @@
           <w:color w:val="5A5A5A"/>
           <w:sz w:val="20"/>
         </w:rPr>
-        <w:t>Document Date: October 22, 2026 · Applies to PDF Forensics Suite v1.1.0, build 2026-10-22c</w:t>
+        <w:t>Document Date: October 22, 2026 · Applies to PDF Forensics Suite v1.1.1, build 2026-10-22d</w:t>
       </w:r>
     </w:p>
     <w:p>

</xml_diff>

<commit_message>
Update to how the application handles metadata edits by exiftool and reports on them.
</commit_message>
<xml_diff>
--- a/Application/Documentation/00_Getting_Started.docx
+++ b/Application/Documentation/00_Getting_Started.docx
@@ -13,7 +13,7 @@
           <w:color w:val="1B1B1B"/>
           <w:sz w:val="52"/>
         </w:rPr>
-        <w:t>PDF FORENSICS SUITE v1.1.1</w:t>
+        <w:t>PDF FORENSICS SUITE v1.1.2</w:t>
       </w:r>
     </w:p>
     <w:p>
@@ -83,7 +83,7 @@
           <w:color w:val="5A5A5A"/>
           <w:sz w:val="20"/>
         </w:rPr>
-        <w:t>Document Date: October 22, 2026 · Applies to PDF Forensics Suite v1.1.1, build 2026-10-22d</w:t>
+        <w:t>Document Date: October 22, 2026 · Applies to PDF Forensics Suite v1.1.2, build 2026-10-22e</w:t>
       </w:r>
     </w:p>
     <w:p>

</xml_diff>

<commit_message>
Corrected an assertion that was being made about exiftool
In the prior version, it stated that the edits were done by exiftool without any caveat. This one adds a caveat. In fact, the caveat here really applies to all metadata in a PDF.
</commit_message>
<xml_diff>
--- a/Application/Documentation/00_Getting_Started.docx
+++ b/Application/Documentation/00_Getting_Started.docx
@@ -13,7 +13,7 @@
           <w:color w:val="1B1B1B"/>
           <w:sz w:val="52"/>
         </w:rPr>
-        <w:t>PDF FORENSICS SUITE v1.1.2</w:t>
+        <w:t>PDF FORENSICS SUITE v1.1.3</w:t>
       </w:r>
     </w:p>
     <w:p>
@@ -83,7 +83,7 @@
           <w:color w:val="5A5A5A"/>
           <w:sz w:val="20"/>
         </w:rPr>
-        <w:t>Document Date: October 22, 2026 · Applies to PDF Forensics Suite v1.1.2, build 2026-10-22e</w:t>
+        <w:t>Document Date: October 22, 2026 · Applies to PDF Forensics Suite v1.1.3, build 2026-10-22f</w:t>
       </w:r>
     </w:p>
     <w:p>

</xml_diff>

<commit_message>
GUI and minor backend change
GUI PDF Forensic Analysis updated to better communicate what is being processed (counts). And reorganized the triage option at the bottom to be either triage or full. Full does not include the triage. You run triage first, then full if you wish to further process.
</commit_message>
<xml_diff>
--- a/Application/Documentation/00_Getting_Started.docx
+++ b/Application/Documentation/00_Getting_Started.docx
@@ -13,7 +13,7 @@
           <w:color w:val="1B1B1B"/>
           <w:sz w:val="52"/>
         </w:rPr>
-        <w:t>PDF FORENSICS SUITE v1.1.3</w:t>
+        <w:t>PDF FORENSICS SUITE v1.1.4</w:t>
       </w:r>
     </w:p>
     <w:p>
@@ -83,7 +83,7 @@
           <w:color w:val="5A5A5A"/>
           <w:sz w:val="20"/>
         </w:rPr>
-        <w:t>Document Date: October 22, 2026 · Applies to PDF Forensics Suite v1.1.3, build 2026-10-22f</w:t>
+        <w:t>Document Date: October 22, 2026 · Applies to PDF Forensics Suite v1.1.4, build 2026-10-22g</w:t>
       </w:r>
     </w:p>
     <w:p>
@@ -354,7 +354,7 @@
           <w:color w:val="1B1B1B"/>
           <w:sz w:val="22"/>
         </w:rPr>
-        <w:t>Review the options. “Store extracted images in database” keeps image thumbnails for the reports and graph; “Extract and process prior PDF versions” analyses earlier saved versions when a document contains incremental updates; “Skip PDFs already in the database” avoids re-analysing files on a repeat run.</w:t>
+        <w:t xml:space="preserve">Choose the processing mode under Processing. Triage (the default) is a quick scan to an Excel spreadsheet and writes nothing to the database. Full parsing runs the complete forensic analysis into the case database, and selecting it reveals its options and the database below them. “Store extracted images in database” keeps image thumbnails for the reports and graph; “Extract and process prior PDF versions” analyses earlier saved versions when a document contains incremental updates; “Skip PDFs already in the database” avoids re-analysing files on a repeat run. The Database field sits under these options because only full parsing writes to the database; choose an existing database to append to it, or a new file name to create one. The two modes are separate: full parsing does not write a triage spreadsheet, so if you want one as well, run Triage separately; a note under the two options says what the selected mode produces. Each triage run writes its own spreadsheet, named with the time of that run, so running triage again in the same session keeps the earlier spreadsheet.</w:t>
       </w:r>
     </w:p>
     <w:p>
@@ -381,7 +381,7 @@
           <w:color w:val="1B1B1B"/>
           <w:sz w:val="22"/>
         </w:rPr>
-        <w:t>Click Run analysis. Progress is shown by a progress bar and a status line indicating which file (and page) is being processed, alongside the scrolling processing log.</w:t>
+        <w:t>Click Run analysis (Run triage when Triage is selected). Progress is shown by a progress bar and a status line indicating which file (and page) is being processed, alongside the scrolling processing log.</w:t>
       </w:r>
     </w:p>
     <w:p>
@@ -395,7 +395,7 @@
           <w:sz w:val="22"/>
           <w:szCs w:val="22"/>
         </w:rPr>
-        <w:t xml:space="preserve">When the run finishes, a summary accounts for every file you submitted, for example: “12 submitted: 6 analysed, 6 skipped as identical copies of files already analysed, 0 failed; plus 4 prior versions extracted and analysed.” The counters above the log show the same figures (Processed, Failed, Copies, Images), and the summary is written to the session log. If a file fails, the reason is shown in the log.</w:t>
+        <w:t xml:space="preserve">When the run finishes, a summary accounts for every file you submitted, for example: “12 submitted: 6 analysed, 6 skipped as identical copies of files already analysed, 0 failed; plus 4 prior versions extracted and analysed.” The counters above the log show the same figures (Processed, Prior versions, Failed, Copies, Images): Processed counts only the files you selected, and Prior versions the earlier versions recovered from them, and the summary is written to the session log. If a file fails, the reason is shown in the log.</w:t>
       </w:r>
     </w:p>
     <w:p>
@@ -408,7 +408,7 @@
           <w:color w:val="1B1B1B"/>
           <w:sz w:val="22"/>
         </w:rPr>
-        <w:t>If you only need a fast overview of a large set of documents rather than a full examination, enable Triage mode, which writes a summary Excel spreadsheet instead of running the complete analysis. The triage spreadsheet has a pdf-triage overview sheet and a pdf-metadata sheet; when a document contains incremental updates, each prior version’s metadata is included as its own row, labelled in a Source column (“Current” or “Prior v1”, “Prior v2”, and so on), so the metadata of earlier saved versions can be compared against the current one without running a full analysis.</w:t>
+        <w:t>If you only need a fast overview of a large set of documents rather than a full examination, choose Triage under Processing, which writes a summary Excel spreadsheet instead of running the complete analysis. The triage spreadsheet has a pdf-triage overview sheet and a pdf-metadata sheet; when a document contains incremental updates, each prior version’s metadata is included as its own row, labelled in a Source column (“Current” or “Prior v1”, “Prior v2”, and so on), so the metadata of earlier saved versions can be compared against the current one without running a full analysis.</w:t>
       </w:r>
     </w:p>
     <w:p>

</xml_diff>